<commit_message>
Docs y manuales locales + SQL 25/10
Co-Authored-By: Claude Sonnet 5 <noreply@anthropic.com>
</commit_message>
<xml_diff>
--- a/gestion-solicitudes-voae/docs/manuales/Manual_Usuario_Administrador.docx
+++ b/gestion-solicitudes-voae/docs/manuales/Manual_Usuario_Administrador.docx
@@ -164,30 +164,7 @@
           <w:sz w:val="22"/>
           <w:szCs w:val="22"/>
         </w:rPr>
-        <w:t xml:space="preserve">______________________________</w:t>
-      </w:r>
-    </w:p>
-    <w:p>
-      <w:pPr>
-        <w:spacing w:after="80"/>
-        <w:jc w:val="center"/>
-      </w:pPr>
-      <w:r>
-        <w:rPr>
-          <w:b/>
-          <w:bCs/>
-          <w:color w:val="12397A"/>
-          <w:sz w:val="22"/>
-          <w:szCs w:val="22"/>
-        </w:rPr>
-        <w:t xml:space="preserve">Revisado por: </w:t>
-      </w:r>
-      <w:r>
-        <w:rPr>
-          <w:sz w:val="22"/>
-          <w:szCs w:val="22"/>
-        </w:rPr>
-        <w:t xml:space="preserve">______________________________</w:t>
+        <w:t xml:space="preserve">Jade Miralda y Angie Enamorado</w:t>
       </w:r>
     </w:p>
     <w:p>

</xml_diff>